<commit_message>
Dorade diplomskog prema predlosku
</commit_message>
<xml_diff>
--- a/Diplomski_rad_predložak_lipanj_2026.docx
+++ b/Diplomski_rad_predložak_lipanj_2026.docx
@@ -2329,7 +2329,7 @@
           <w:b/>
           <w:bCs/>
         </w:rPr>
-        <w:t xml:space="preserve">Table </w:t>
+        <w:t xml:space="preserve">Table of </w:t>
       </w:r>
       <w:proofErr w:type="spellStart"/>
       <w:r>
@@ -2337,7 +2337,7 @@
           <w:b/>
           <w:bCs/>
         </w:rPr>
-        <w:t>of</w:t>
+        <w:t>Contents</w:t>
       </w:r>
       <w:proofErr w:type="spellEnd"/>
       <w:r>
@@ -2345,39 +2345,7 @@
           <w:b/>
           <w:bCs/>
         </w:rPr>
-        <w:t xml:space="preserve"> </w:t>
-      </w:r>
-      <w:proofErr w:type="spellStart"/>
-      <w:r>
-        <w:rPr>
-          <w:b/>
-          <w:bCs/>
-        </w:rPr>
-        <w:t>Contents</w:t>
-      </w:r>
-      <w:proofErr w:type="spellEnd"/>
-      <w:r>
-        <w:rPr>
-          <w:b/>
-          <w:bCs/>
-        </w:rPr>
-        <w:t xml:space="preserve"> – Insert Table </w:t>
-      </w:r>
-      <w:proofErr w:type="spellStart"/>
-      <w:r>
-        <w:rPr>
-          <w:b/>
-          <w:bCs/>
-        </w:rPr>
-        <w:t>of</w:t>
-      </w:r>
-      <w:proofErr w:type="spellEnd"/>
-      <w:r>
-        <w:rPr>
-          <w:b/>
-          <w:bCs/>
-        </w:rPr>
-        <w:t xml:space="preserve"> </w:t>
+        <w:t xml:space="preserve"> – Insert Table of </w:t>
       </w:r>
       <w:proofErr w:type="spellStart"/>
       <w:r>
@@ -2573,7 +2541,10 @@
       <w:bookmarkStart w:id="5" w:name="_Toc231378084"/>
       <w:r>
         <w:lastRenderedPageBreak/>
-        <w:t>Naslov prvog poglavlja</w:t>
+        <w:t xml:space="preserve">Naslov prvog </w:t>
+      </w:r>
+      <w:r>
+        <w:t>poglavlja</w:t>
       </w:r>
       <w:bookmarkEnd w:id="4"/>
       <w:bookmarkEnd w:id="5"/>
@@ -3640,10 +3611,10 @@
             <v:path o:extrusionok="f" gradientshapeok="t" o:connecttype="rect"/>
             <o:lock v:ext="edit" aspectratio="t"/>
           </v:shapetype>
-          <v:shape id="_x0000_i1028" type="#_x0000_t75" style="width:219.2pt;height:77.35pt" o:ole="">
+          <v:shape id="_x0000_i1025" type="#_x0000_t75" style="width:219pt;height:77.25pt" o:ole="">
             <v:imagedata r:id="rId14" o:title=""/>
           </v:shape>
-          <o:OLEObject Type="Embed" ProgID="Visio.Drawing.6" ShapeID="_x0000_i1028" DrawAspect="Content" ObjectID="_1841990867" r:id="rId15"/>
+          <o:OLEObject Type="Embed" ProgID="Visio.Drawing.6" ShapeID="_x0000_i1025" DrawAspect="Content" ObjectID="_1843895024" r:id="rId15"/>
         </w:object>
       </w:r>
     </w:p>
@@ -4452,8 +4423,8 @@
       <w:pPr>
         <w:pStyle w:val="Caption"/>
       </w:pPr>
-      <w:bookmarkStart w:id="13" w:name="_Ref11810981"/>
-      <w:bookmarkStart w:id="14" w:name="_Ref7328837"/>
+      <w:bookmarkStart w:id="13" w:name="_Ref7328837"/>
+      <w:bookmarkStart w:id="14" w:name="_Ref11810981"/>
       <w:r>
         <w:t xml:space="preserve">Sl. </w:t>
       </w:r>
@@ -4470,7 +4441,7 @@
           <w:t>4</w:t>
         </w:r>
       </w:fldSimple>
-      <w:bookmarkEnd w:id="14"/>
+      <w:bookmarkEnd w:id="13"/>
       <w:r>
         <w:t xml:space="preserve"> Ubacivanje </w:t>
       </w:r>
@@ -4486,7 +4457,7 @@
       <w:r>
         <w:t xml:space="preserve"> u tekstu</w:t>
       </w:r>
-      <w:bookmarkEnd w:id="13"/>
+      <w:bookmarkEnd w:id="14"/>
     </w:p>
     <w:p>
       <w:r>
@@ -4765,12 +4736,6 @@
         <w:gridCol w:w="1461"/>
       </w:tblGrid>
       <w:tr>
-        <w:tblPrEx>
-          <w:tblCellMar>
-            <w:top w:w="0" w:type="dxa"/>
-            <w:bottom w:w="0" w:type="dxa"/>
-          </w:tblCellMar>
-        </w:tblPrEx>
         <w:trPr>
           <w:jc w:val="center"/>
         </w:trPr>
@@ -4853,12 +4818,6 @@
         </w:tc>
       </w:tr>
       <w:tr>
-        <w:tblPrEx>
-          <w:tblCellMar>
-            <w:top w:w="0" w:type="dxa"/>
-            <w:bottom w:w="0" w:type="dxa"/>
-          </w:tblCellMar>
-        </w:tblPrEx>
         <w:trPr>
           <w:jc w:val="center"/>
         </w:trPr>
@@ -6066,6 +6025,22 @@
           <w:i/>
           <w:lang w:val="hr-HR"/>
         </w:rPr>
+        <w:t xml:space="preserve"> of On-</w:t>
+      </w:r>
+      <w:proofErr w:type="spellStart"/>
+      <w:r>
+        <w:rPr>
+          <w:i/>
+          <w:lang w:val="hr-HR"/>
+        </w:rPr>
+        <w:t>off</w:t>
+      </w:r>
+      <w:proofErr w:type="spellEnd"/>
+      <w:r>
+        <w:rPr>
+          <w:i/>
+          <w:lang w:val="hr-HR"/>
+        </w:rPr>
         <w:t xml:space="preserve"> </w:t>
       </w:r>
       <w:proofErr w:type="spellStart"/>
@@ -6074,7 +6049,7 @@
           <w:i/>
           <w:lang w:val="hr-HR"/>
         </w:rPr>
-        <w:t>of</w:t>
+        <w:t>Patterns</w:t>
       </w:r>
       <w:proofErr w:type="spellEnd"/>
       <w:r>
@@ -6082,7 +6057,7 @@
           <w:i/>
           <w:lang w:val="hr-HR"/>
         </w:rPr>
-        <w:t xml:space="preserve"> On-</w:t>
+        <w:t xml:space="preserve"> </w:t>
       </w:r>
       <w:proofErr w:type="spellStart"/>
       <w:r>
@@ -6090,7 +6065,7 @@
           <w:i/>
           <w:lang w:val="hr-HR"/>
         </w:rPr>
-        <w:t>off</w:t>
+        <w:t>in</w:t>
       </w:r>
       <w:proofErr w:type="spellEnd"/>
       <w:r>
@@ -6098,15 +6073,120 @@
           <w:i/>
           <w:lang w:val="hr-HR"/>
         </w:rPr>
+        <w:t xml:space="preserve"> 16 </w:t>
+      </w:r>
+      <w:proofErr w:type="spellStart"/>
+      <w:r>
+        <w:rPr>
+          <w:i/>
+          <w:lang w:val="hr-HR"/>
+        </w:rPr>
+        <w:t>Conversation</w:t>
+      </w:r>
+      <w:r>
+        <w:rPr>
+          <w:i/>
+          <w:lang w:val="hr-HR"/>
+        </w:rPr>
+        <w:t>s</w:t>
+      </w:r>
+      <w:proofErr w:type="spellEnd"/>
+      <w:r>
+        <w:rPr>
+          <w:lang w:val="hr-HR"/>
+        </w:rPr>
+        <w:t xml:space="preserve">, </w:t>
+      </w:r>
+      <w:r>
+        <w:rPr>
+          <w:iCs/>
+          <w:lang w:val="hr-HR"/>
+        </w:rPr>
+        <w:t xml:space="preserve">Bell System </w:t>
+      </w:r>
+      <w:proofErr w:type="spellStart"/>
+      <w:r>
+        <w:rPr>
+          <w:iCs/>
+          <w:lang w:val="hr-HR"/>
+        </w:rPr>
+        <w:t>Technical</w:t>
+      </w:r>
+      <w:proofErr w:type="spellEnd"/>
+      <w:r>
+        <w:rPr>
+          <w:iCs/>
+          <w:lang w:val="hr-HR"/>
+        </w:rPr>
+        <w:t xml:space="preserve"> Journal</w:t>
+      </w:r>
+      <w:r>
+        <w:rPr>
+          <w:lang w:val="hr-HR"/>
+        </w:rPr>
+        <w:t xml:space="preserve">, 47,1 (1998), </w:t>
+      </w:r>
+      <w:r>
+        <w:rPr>
+          <w:lang w:val="hr-HR"/>
+        </w:rPr>
+        <w:t xml:space="preserve">str. </w:t>
+      </w:r>
+      <w:r>
+        <w:rPr>
+          <w:lang w:val="hr-HR"/>
+        </w:rPr>
+        <w:t>55-62.</w:t>
+      </w:r>
+    </w:p>
+    <w:p>
+      <w:pPr>
+        <w:pStyle w:val="literatura"/>
+        <w:rPr>
+          <w:lang w:val="hr-HR"/>
+        </w:rPr>
+      </w:pPr>
+      <w:proofErr w:type="spellStart"/>
+      <w:r>
+        <w:rPr>
+          <w:lang w:val="hr-HR"/>
+        </w:rPr>
+        <w:t>Brady</w:t>
+      </w:r>
+      <w:proofErr w:type="spellEnd"/>
+      <w:r>
+        <w:rPr>
+          <w:lang w:val="hr-HR"/>
+        </w:rPr>
+        <w:t>, N.</w:t>
+      </w:r>
+      <w:r>
+        <w:rPr>
+          <w:lang w:val="hr-HR"/>
+        </w:rPr>
         <w:t xml:space="preserve"> </w:t>
       </w:r>
+      <w:r>
+        <w:rPr>
+          <w:i/>
+          <w:lang w:val="hr-HR"/>
+        </w:rPr>
+        <w:t xml:space="preserve">A </w:t>
+      </w:r>
       <w:proofErr w:type="spellStart"/>
       <w:r>
         <w:rPr>
           <w:i/>
           <w:lang w:val="hr-HR"/>
         </w:rPr>
-        <w:t>Patterns</w:t>
+        <w:t>S</w:t>
+      </w:r>
+      <w:r>
+        <w:rPr>
+          <w:i/>
+          <w:lang w:val="hr-HR"/>
+        </w:rPr>
+        <w:t>tatistical</w:t>
       </w:r>
       <w:proofErr w:type="spellEnd"/>
       <w:r>
@@ -6122,7 +6202,7 @@
           <w:i/>
           <w:lang w:val="hr-HR"/>
         </w:rPr>
-        <w:t>in</w:t>
+        <w:t>Analysis</w:t>
       </w:r>
       <w:proofErr w:type="spellEnd"/>
       <w:r>
@@ -6130,7 +6210,7 @@
           <w:i/>
           <w:lang w:val="hr-HR"/>
         </w:rPr>
-        <w:t xml:space="preserve"> 16 </w:t>
+        <w:t xml:space="preserve"> of Use </w:t>
       </w:r>
       <w:proofErr w:type="spellStart"/>
       <w:r>
@@ -6138,199 +6218,30 @@
           <w:i/>
           <w:lang w:val="hr-HR"/>
         </w:rPr>
-        <w:t>Conversation</w:t>
-      </w:r>
-      <w:r>
-        <w:rPr>
-          <w:i/>
-          <w:lang w:val="hr-HR"/>
-        </w:rPr>
-        <w:t>s</w:t>
+        <w:t>Case</w:t>
       </w:r>
       <w:proofErr w:type="spellEnd"/>
       <w:r>
         <w:rPr>
           <w:lang w:val="hr-HR"/>
         </w:rPr>
-        <w:t xml:space="preserve">, </w:t>
-      </w:r>
+        <w:t xml:space="preserve">. </w:t>
+      </w:r>
+      <w:proofErr w:type="spellStart"/>
       <w:r>
         <w:rPr>
           <w:iCs/>
           <w:lang w:val="hr-HR"/>
         </w:rPr>
-        <w:t xml:space="preserve">Bell System </w:t>
-      </w:r>
-      <w:proofErr w:type="spellStart"/>
+        <w:t>Proceedings</w:t>
+      </w:r>
+      <w:proofErr w:type="spellEnd"/>
       <w:r>
         <w:rPr>
           <w:iCs/>
           <w:lang w:val="hr-HR"/>
         </w:rPr>
-        <w:t>Technical</w:t>
-      </w:r>
-      <w:proofErr w:type="spellEnd"/>
-      <w:r>
-        <w:rPr>
-          <w:iCs/>
-          <w:lang w:val="hr-HR"/>
-        </w:rPr>
-        <w:t xml:space="preserve"> Journal</w:t>
-      </w:r>
-      <w:r>
-        <w:rPr>
-          <w:lang w:val="hr-HR"/>
-        </w:rPr>
-        <w:t xml:space="preserve">, 47,1 (1998), </w:t>
-      </w:r>
-      <w:r>
-        <w:rPr>
-          <w:lang w:val="hr-HR"/>
-        </w:rPr>
-        <w:t xml:space="preserve">str. </w:t>
-      </w:r>
-      <w:r>
-        <w:rPr>
-          <w:lang w:val="hr-HR"/>
-        </w:rPr>
-        <w:t>55-62.</w:t>
-      </w:r>
-    </w:p>
-    <w:p>
-      <w:pPr>
-        <w:pStyle w:val="literatura"/>
-        <w:rPr>
-          <w:lang w:val="hr-HR"/>
-        </w:rPr>
-      </w:pPr>
-      <w:proofErr w:type="spellStart"/>
-      <w:r>
-        <w:rPr>
-          <w:lang w:val="hr-HR"/>
-        </w:rPr>
-        <w:t>Brady</w:t>
-      </w:r>
-      <w:proofErr w:type="spellEnd"/>
-      <w:r>
-        <w:rPr>
-          <w:lang w:val="hr-HR"/>
-        </w:rPr>
-        <w:t>, N.</w:t>
-      </w:r>
-      <w:r>
-        <w:rPr>
-          <w:lang w:val="hr-HR"/>
-        </w:rPr>
-        <w:t xml:space="preserve"> </w:t>
-      </w:r>
-      <w:r>
-        <w:rPr>
-          <w:i/>
-          <w:lang w:val="hr-HR"/>
-        </w:rPr>
-        <w:t xml:space="preserve">A </w:t>
-      </w:r>
-      <w:proofErr w:type="spellStart"/>
-      <w:r>
-        <w:rPr>
-          <w:i/>
-          <w:lang w:val="hr-HR"/>
-        </w:rPr>
-        <w:t>S</w:t>
-      </w:r>
-      <w:r>
-        <w:rPr>
-          <w:i/>
-          <w:lang w:val="hr-HR"/>
-        </w:rPr>
-        <w:t>tatistical</w:t>
-      </w:r>
-      <w:proofErr w:type="spellEnd"/>
-      <w:r>
-        <w:rPr>
-          <w:i/>
-          <w:lang w:val="hr-HR"/>
-        </w:rPr>
-        <w:t xml:space="preserve"> </w:t>
-      </w:r>
-      <w:proofErr w:type="spellStart"/>
-      <w:r>
-        <w:rPr>
-          <w:i/>
-          <w:lang w:val="hr-HR"/>
-        </w:rPr>
-        <w:t>Analysis</w:t>
-      </w:r>
-      <w:proofErr w:type="spellEnd"/>
-      <w:r>
-        <w:rPr>
-          <w:i/>
-          <w:lang w:val="hr-HR"/>
-        </w:rPr>
-        <w:t xml:space="preserve"> </w:t>
-      </w:r>
-      <w:proofErr w:type="spellStart"/>
-      <w:r>
-        <w:rPr>
-          <w:i/>
-          <w:lang w:val="hr-HR"/>
-        </w:rPr>
-        <w:t>of</w:t>
-      </w:r>
-      <w:proofErr w:type="spellEnd"/>
-      <w:r>
-        <w:rPr>
-          <w:i/>
-          <w:lang w:val="hr-HR"/>
-        </w:rPr>
-        <w:t xml:space="preserve"> Use </w:t>
-      </w:r>
-      <w:proofErr w:type="spellStart"/>
-      <w:r>
-        <w:rPr>
-          <w:i/>
-          <w:lang w:val="hr-HR"/>
-        </w:rPr>
-        <w:t>Case</w:t>
-      </w:r>
-      <w:proofErr w:type="spellEnd"/>
-      <w:r>
-        <w:rPr>
-          <w:lang w:val="hr-HR"/>
-        </w:rPr>
-        <w:t xml:space="preserve">. </w:t>
-      </w:r>
-      <w:proofErr w:type="spellStart"/>
-      <w:r>
-        <w:rPr>
-          <w:iCs/>
-          <w:lang w:val="hr-HR"/>
-        </w:rPr>
-        <w:t>Proceedings</w:t>
-      </w:r>
-      <w:proofErr w:type="spellEnd"/>
-      <w:r>
-        <w:rPr>
-          <w:iCs/>
-          <w:lang w:val="hr-HR"/>
-        </w:rPr>
-        <w:t xml:space="preserve"> </w:t>
-      </w:r>
-      <w:proofErr w:type="spellStart"/>
-      <w:r>
-        <w:rPr>
-          <w:iCs/>
-          <w:lang w:val="hr-HR"/>
-        </w:rPr>
-        <w:t>of</w:t>
-      </w:r>
-      <w:proofErr w:type="spellEnd"/>
-      <w:r>
-        <w:rPr>
-          <w:iCs/>
-          <w:lang w:val="hr-HR"/>
-        </w:rPr>
-        <w:t xml:space="preserve"> </w:t>
+        <w:t xml:space="preserve"> of </w:t>
       </w:r>
       <w:proofErr w:type="spellStart"/>
       <w:r>
@@ -6663,21 +6574,7 @@
             <w:rStyle w:val="Hyperlink"/>
             <w:lang w:val="hr-HR"/>
           </w:rPr>
-          <w:t>https://www.pcgamer.com/best-</w:t>
-        </w:r>
-        <w:r>
-          <w:rPr>
-            <w:rStyle w:val="Hyperlink"/>
-            <w:lang w:val="hr-HR"/>
-          </w:rPr>
-          <w:t>v</w:t>
-        </w:r>
-        <w:r>
-          <w:rPr>
-            <w:rStyle w:val="Hyperlink"/>
-            <w:lang w:val="hr-HR"/>
-          </w:rPr>
-          <w:t>r-headset/</w:t>
+          <w:t>https://www.pcgamer.com/best-vr-headset/</w:t>
         </w:r>
       </w:hyperlink>
       <w:r>
@@ -7148,13 +7045,7 @@
         <w:t>Osvrt na korištenje umjetne inteligencije:</w:t>
       </w:r>
       <w:r>
-        <w:t xml:space="preserve"> Ukratko opišite opseg vlastitih intervencija i dorada generiranog sadržaja te, ako je primjenjivo, navedite procjenu točnosti,</w:t>
-      </w:r>
-      <w:r>
-        <w:t xml:space="preserve"> </w:t>
-      </w:r>
-      <w:r>
-        <w:t>uočena ograničenja ili halucinacije korištene umjetne inteligencije.</w:t>
+        <w:t xml:space="preserve"> Ukratko opišite opseg vlastitih intervencija i dorada generiranog sadržaja te, ako je primjenjivo, navedite procjenu točnosti, uočena ograničenja ili halucinacije korištene umjetne inteligencije.</w:t>
       </w:r>
     </w:p>
     <w:p>
@@ -7166,13 +7057,7 @@
         <w:t>Izjava o korištenju umjetne inteligencije:</w:t>
       </w:r>
       <w:r>
-        <w:t xml:space="preserve"> Potvrđujem da sam tijekom izrade ovog</w:t>
-      </w:r>
-      <w:r>
-        <w:t xml:space="preserve"> </w:t>
-      </w:r>
-      <w:r>
-        <w:t>završnog</w:t>
+        <w:t xml:space="preserve"> Potvrđujem da sam tijekom izrade ovog završnog</w:t>
       </w:r>
       <w:r>
         <w:t xml:space="preserve"> </w:t>
@@ -7672,15 +7557,7 @@
       </w:r>
       <w:proofErr w:type="spellEnd"/>
       <w:r>
-        <w:t xml:space="preserve"> - opcija </w:t>
-      </w:r>
-      <w:proofErr w:type="spellStart"/>
-      <w:r>
-        <w:t>Language</w:t>
-      </w:r>
-      <w:proofErr w:type="spellEnd"/>
-      <w:r>
-        <w:t xml:space="preserve"> postavite Croatian kao </w:t>
+        <w:t xml:space="preserve"> - opcija Language postavite Croatian kao </w:t>
       </w:r>
       <w:proofErr w:type="spellStart"/>
       <w:r>
@@ -9232,6 +9109,50 @@
     <w:lsdException w:name="Emphasis" w:qFormat="1"/>
     <w:lsdException w:name="Normal (Web)" w:uiPriority="99"/>
     <w:lsdException w:name="HTML Typewriter" w:uiPriority="99"/>
+    <w:lsdException w:name="Normal Table" w:semiHidden="1" w:unhideWhenUsed="1"/>
+    <w:lsdException w:name="Table Simple 1" w:semiHidden="1" w:unhideWhenUsed="1"/>
+    <w:lsdException w:name="Table Simple 2" w:semiHidden="1" w:unhideWhenUsed="1"/>
+    <w:lsdException w:name="Table Simple 3" w:semiHidden="1" w:unhideWhenUsed="1"/>
+    <w:lsdException w:name="Table Classic 1" w:semiHidden="1" w:unhideWhenUsed="1"/>
+    <w:lsdException w:name="Table Classic 2" w:semiHidden="1" w:unhideWhenUsed="1"/>
+    <w:lsdException w:name="Table Classic 3" w:semiHidden="1" w:unhideWhenUsed="1"/>
+    <w:lsdException w:name="Table Classic 4" w:semiHidden="1" w:unhideWhenUsed="1"/>
+    <w:lsdException w:name="Table Colorful 1" w:semiHidden="1" w:unhideWhenUsed="1"/>
+    <w:lsdException w:name="Table Colorful 2" w:semiHidden="1" w:unhideWhenUsed="1"/>
+    <w:lsdException w:name="Table Colorful 3" w:semiHidden="1" w:unhideWhenUsed="1"/>
+    <w:lsdException w:name="Table Columns 1" w:semiHidden="1" w:unhideWhenUsed="1"/>
+    <w:lsdException w:name="Table Columns 2" w:semiHidden="1" w:unhideWhenUsed="1"/>
+    <w:lsdException w:name="Table Columns 3" w:semiHidden="1" w:unhideWhenUsed="1"/>
+    <w:lsdException w:name="Table Columns 4" w:semiHidden="1" w:unhideWhenUsed="1"/>
+    <w:lsdException w:name="Table Columns 5" w:semiHidden="1" w:unhideWhenUsed="1"/>
+    <w:lsdException w:name="Table Grid 1" w:semiHidden="1" w:unhideWhenUsed="1"/>
+    <w:lsdException w:name="Table Grid 2" w:semiHidden="1" w:unhideWhenUsed="1"/>
+    <w:lsdException w:name="Table Grid 3" w:semiHidden="1" w:unhideWhenUsed="1"/>
+    <w:lsdException w:name="Table Grid 4" w:semiHidden="1" w:unhideWhenUsed="1"/>
+    <w:lsdException w:name="Table Grid 5" w:semiHidden="1" w:unhideWhenUsed="1"/>
+    <w:lsdException w:name="Table Grid 6" w:semiHidden="1" w:unhideWhenUsed="1"/>
+    <w:lsdException w:name="Table Grid 7" w:semiHidden="1" w:unhideWhenUsed="1"/>
+    <w:lsdException w:name="Table Grid 8" w:semiHidden="1" w:unhideWhenUsed="1"/>
+    <w:lsdException w:name="Table List 1" w:semiHidden="1" w:unhideWhenUsed="1"/>
+    <w:lsdException w:name="Table List 2" w:semiHidden="1" w:unhideWhenUsed="1"/>
+    <w:lsdException w:name="Table List 3" w:semiHidden="1" w:unhideWhenUsed="1"/>
+    <w:lsdException w:name="Table List 4" w:semiHidden="1" w:unhideWhenUsed="1"/>
+    <w:lsdException w:name="Table List 5" w:semiHidden="1" w:unhideWhenUsed="1"/>
+    <w:lsdException w:name="Table List 6" w:semiHidden="1" w:unhideWhenUsed="1"/>
+    <w:lsdException w:name="Table List 7" w:semiHidden="1" w:unhideWhenUsed="1"/>
+    <w:lsdException w:name="Table List 8" w:semiHidden="1" w:unhideWhenUsed="1"/>
+    <w:lsdException w:name="Table 3D effects 1" w:semiHidden="1" w:unhideWhenUsed="1"/>
+    <w:lsdException w:name="Table 3D effects 2" w:semiHidden="1" w:unhideWhenUsed="1"/>
+    <w:lsdException w:name="Table 3D effects 3" w:semiHidden="1" w:unhideWhenUsed="1"/>
+    <w:lsdException w:name="Table Contemporary" w:semiHidden="1" w:unhideWhenUsed="1"/>
+    <w:lsdException w:name="Table Elegant" w:semiHidden="1" w:unhideWhenUsed="1"/>
+    <w:lsdException w:name="Table Professional" w:semiHidden="1" w:unhideWhenUsed="1"/>
+    <w:lsdException w:name="Table Subtle 1" w:semiHidden="1" w:unhideWhenUsed="1"/>
+    <w:lsdException w:name="Table Subtle 2" w:semiHidden="1" w:unhideWhenUsed="1"/>
+    <w:lsdException w:name="Table Web 1" w:semiHidden="1" w:unhideWhenUsed="1"/>
+    <w:lsdException w:name="Table Web 2" w:semiHidden="1" w:unhideWhenUsed="1"/>
+    <w:lsdException w:name="Table Web 3" w:semiHidden="1" w:unhideWhenUsed="1"/>
+    <w:lsdException w:name="Table Theme" w:semiHidden="1" w:unhideWhenUsed="1"/>
     <w:lsdException w:name="Placeholder Text" w:semiHidden="1" w:uiPriority="99"/>
     <w:lsdException w:name="No Spacing" w:uiPriority="1" w:qFormat="1"/>
     <w:lsdException w:name="Light Shading" w:uiPriority="60"/>
@@ -9653,11 +9574,15 @@
   </w:style>
   <w:style w:type="character" w:default="1" w:styleId="DefaultParagraphFont">
     <w:name w:val="Default Paragraph Font"/>
+    <w:uiPriority w:val="1"/>
     <w:semiHidden/>
+    <w:unhideWhenUsed/>
   </w:style>
   <w:style w:type="table" w:default="1" w:styleId="TableNormal">
     <w:name w:val="Normal Table"/>
+    <w:uiPriority w:val="99"/>
     <w:semiHidden/>
+    <w:unhideWhenUsed/>
     <w:tblPr>
       <w:tblInd w:w="0" w:type="dxa"/>
       <w:tblCellMar>
@@ -9670,7 +9595,9 @@
   </w:style>
   <w:style w:type="numbering" w:default="1" w:styleId="NoList">
     <w:name w:val="No List"/>
+    <w:uiPriority w:val="99"/>
     <w:semiHidden/>
+    <w:unhideWhenUsed/>
   </w:style>
   <w:style w:type="paragraph" w:styleId="Caption">
     <w:name w:val="caption"/>
@@ -9770,9 +9697,6 @@
       <w:numPr>
         <w:numId w:val="6"/>
       </w:numPr>
-      <w:tabs>
-        <w:tab w:val="num" w:leader="none" w:pos="850"/>
-      </w:tabs>
       <w:spacing w:after="60"/>
     </w:pPr>
     <w:rPr>
@@ -9787,9 +9711,6 @@
       <w:numPr>
         <w:numId w:val="7"/>
       </w:numPr>
-      <w:tabs>
-        <w:tab w:val="num" w:leader="none" w:pos="851"/>
-      </w:tabs>
       <w:spacing w:after="60"/>
       <w:ind w:left="850" w:hanging="425"/>
     </w:pPr>
@@ -10556,6 +10477,10 @@
 </file>
 
 <file path=customXml/item1.xml><?xml version="1.0" encoding="utf-8"?>
+<b:Sources xmlns:b="http://schemas.openxmlformats.org/officeDocument/2006/bibliography" xmlns="http://schemas.openxmlformats.org/officeDocument/2006/bibliography" SelectedStyle="" StyleName=""/>
+</file>
+
+<file path=customXml/item2.xml><?xml version="1.0" encoding="utf-8"?>
 <ct:contentTypeSchema xmlns:ct="http://schemas.microsoft.com/office/2006/metadata/contentType" xmlns:ma="http://schemas.microsoft.com/office/2006/metadata/properties/metaAttributes" ct:_="" ma:_="" ma:contentTypeName="Dokument" ma:contentTypeID="0x0101008B745E83D8115245A8D1ADF80A3890BA" ma:contentTypeVersion="13" ma:contentTypeDescription="Stvaranje novog dokumenta." ma:contentTypeScope="" ma:versionID="a27f2829a275489d5984aa1a72490b89">
   <xsd:schema xmlns:xsd="http://www.w3.org/2001/XMLSchema" xmlns:xs="http://www.w3.org/2001/XMLSchema" xmlns:p="http://schemas.microsoft.com/office/2006/metadata/properties" xmlns:ns3="7c097320-6bba-49ec-a060-a2cd4188ceea" xmlns:ns4="c90fddfb-63ac-4e82-9923-c0faed2978db" targetNamespace="http://schemas.microsoft.com/office/2006/metadata/properties" ma:root="true" ma:fieldsID="d04262c8c13f3e7f52107fbeea22bf7e" ns3:_="" ns4:_="">
     <xsd:import namespace="7c097320-6bba-49ec-a060-a2cd4188ceea"/>
@@ -10778,11 +10703,13 @@
 </ct:contentTypeSchema>
 </file>
 
-<file path=customXml/item2.xml><?xml version="1.0" encoding="utf-8"?>
-<b:Sources xmlns:b="http://schemas.openxmlformats.org/officeDocument/2006/bibliography" xmlns="http://schemas.openxmlformats.org/officeDocument/2006/bibliography" SelectedStyle="" StyleName=""/>
+<file path=customXml/item3.xml><?xml version="1.0" encoding="utf-8"?>
+<p:properties xmlns:p="http://schemas.microsoft.com/office/2006/metadata/properties" xmlns:xsi="http://www.w3.org/2001/XMLSchema-instance" xmlns:pc="http://schemas.microsoft.com/office/infopath/2007/PartnerControls">
+  <documentManagement/>
+</p:properties>
 </file>
 
-<file path=customXml/item3.xml><?xml version="1.0" encoding="utf-8"?>
+<file path=customXml/item4.xml><?xml version="1.0" encoding="utf-8"?>
 <?mso-contentType ?>
 <FormTemplates xmlns="http://schemas.microsoft.com/sharepoint/v3/contenttype/forms">
   <Display>DocumentLibraryForm</Display>
@@ -10791,13 +10718,15 @@
 </FormTemplates>
 </file>
 
-<file path=customXml/item4.xml><?xml version="1.0" encoding="utf-8"?>
-<p:properties xmlns:p="http://schemas.microsoft.com/office/2006/metadata/properties" xmlns:xsi="http://www.w3.org/2001/XMLSchema-instance" xmlns:pc="http://schemas.microsoft.com/office/infopath/2007/PartnerControls">
-  <documentManagement/>
-</p:properties>
+<file path=customXml/itemProps1.xml><?xml version="1.0" encoding="utf-8"?>
+<ds:datastoreItem xmlns:ds="http://schemas.openxmlformats.org/officeDocument/2006/customXml" ds:itemID="{8118E9C1-FB63-4F97-A222-D7ADC7999B27}">
+  <ds:schemaRefs>
+    <ds:schemaRef ds:uri="http://schemas.openxmlformats.org/officeDocument/2006/bibliography"/>
+  </ds:schemaRefs>
+</ds:datastoreItem>
 </file>
 
-<file path=customXml/itemProps1.xml><?xml version="1.0" encoding="utf-8"?>
+<file path=customXml/itemProps2.xml><?xml version="1.0" encoding="utf-8"?>
 <ds:datastoreItem xmlns:ds="http://schemas.openxmlformats.org/officeDocument/2006/customXml" ds:itemID="{C4F4A0A0-25B6-4F0C-9000-00BC1F5E7081}">
   <ds:schemaRefs>
     <ds:schemaRef ds:uri="http://schemas.microsoft.com/office/2006/metadata/contentType"/>
@@ -10816,27 +10745,19 @@
 </ds:datastoreItem>
 </file>
 
-<file path=customXml/itemProps2.xml><?xml version="1.0" encoding="utf-8"?>
-<ds:datastoreItem xmlns:ds="http://schemas.openxmlformats.org/officeDocument/2006/customXml" ds:itemID="{8118E9C1-FB63-4F97-A222-D7ADC7999B27}">
-  <ds:schemaRefs>
-    <ds:schemaRef ds:uri="http://schemas.openxmlformats.org/officeDocument/2006/bibliography"/>
-  </ds:schemaRefs>
-</ds:datastoreItem>
-</file>
-
 <file path=customXml/itemProps3.xml><?xml version="1.0" encoding="utf-8"?>
-<ds:datastoreItem xmlns:ds="http://schemas.openxmlformats.org/officeDocument/2006/customXml" ds:itemID="{1938C5F5-34C8-4331-979B-AD4F4FBB7811}">
-  <ds:schemaRefs>
-    <ds:schemaRef ds:uri="http://schemas.microsoft.com/sharepoint/v3/contenttype/forms"/>
-  </ds:schemaRefs>
-</ds:datastoreItem>
-</file>
-
-<file path=customXml/itemProps4.xml><?xml version="1.0" encoding="utf-8"?>
 <ds:datastoreItem xmlns:ds="http://schemas.openxmlformats.org/officeDocument/2006/customXml" ds:itemID="{2ED5450E-C08E-45C4-87B0-B0BBB0EC6EDB}">
   <ds:schemaRefs>
     <ds:schemaRef ds:uri="http://schemas.microsoft.com/office/2006/metadata/properties"/>
     <ds:schemaRef ds:uri="http://schemas.microsoft.com/office/infopath/2007/PartnerControls"/>
   </ds:schemaRefs>
 </ds:datastoreItem>
+</file>
+
+<file path=customXml/itemProps4.xml><?xml version="1.0" encoding="utf-8"?>
+<ds:datastoreItem xmlns:ds="http://schemas.openxmlformats.org/officeDocument/2006/customXml" ds:itemID="{1938C5F5-34C8-4331-979B-AD4F4FBB7811}">
+  <ds:schemaRefs>
+    <ds:schemaRef ds:uri="http://schemas.microsoft.com/sharepoint/v3/contenttype/forms"/>
+  </ds:schemaRefs>
+</ds:datastoreItem>
 </file>
</xml_diff>

<commit_message>
Manje dorade diplomskoga, stilova, sumnjivih riječi itd.
</commit_message>
<xml_diff>
--- a/Diplomski_rad_predložak_lipanj_2026.docx
+++ b/Diplomski_rad_predložak_lipanj_2026.docx
@@ -3611,10 +3611,10 @@
             <v:path o:extrusionok="f" gradientshapeok="t" o:connecttype="rect"/>
             <o:lock v:ext="edit" aspectratio="t"/>
           </v:shapetype>
-          <v:shape id="_x0000_i1025" type="#_x0000_t75" style="width:219pt;height:77.25pt" o:ole="">
+          <v:shape id="_x0000_i1025" type="#_x0000_t75" style="width:219pt;height:77.4pt" o:ole="">
             <v:imagedata r:id="rId14" o:title=""/>
           </v:shape>
-          <o:OLEObject Type="Embed" ProgID="Visio.Drawing.6" ShapeID="_x0000_i1025" DrawAspect="Content" ObjectID="_1843895024" r:id="rId15"/>
+          <o:OLEObject Type="Embed" ProgID="Visio.Drawing.6" ShapeID="_x0000_i1025" DrawAspect="Content" ObjectID="_1843916854" r:id="rId15"/>
         </w:object>
       </w:r>
     </w:p>
@@ -10477,10 +10477,6 @@
 </file>
 
 <file path=customXml/item1.xml><?xml version="1.0" encoding="utf-8"?>
-<b:Sources xmlns:b="http://schemas.openxmlformats.org/officeDocument/2006/bibliography" xmlns="http://schemas.openxmlformats.org/officeDocument/2006/bibliography" SelectedStyle="" StyleName=""/>
-</file>
-
-<file path=customXml/item2.xml><?xml version="1.0" encoding="utf-8"?>
 <ct:contentTypeSchema xmlns:ct="http://schemas.microsoft.com/office/2006/metadata/contentType" xmlns:ma="http://schemas.microsoft.com/office/2006/metadata/properties/metaAttributes" ct:_="" ma:_="" ma:contentTypeName="Dokument" ma:contentTypeID="0x0101008B745E83D8115245A8D1ADF80A3890BA" ma:contentTypeVersion="13" ma:contentTypeDescription="Stvaranje novog dokumenta." ma:contentTypeScope="" ma:versionID="a27f2829a275489d5984aa1a72490b89">
   <xsd:schema xmlns:xsd="http://www.w3.org/2001/XMLSchema" xmlns:xs="http://www.w3.org/2001/XMLSchema" xmlns:p="http://schemas.microsoft.com/office/2006/metadata/properties" xmlns:ns3="7c097320-6bba-49ec-a060-a2cd4188ceea" xmlns:ns4="c90fddfb-63ac-4e82-9923-c0faed2978db" targetNamespace="http://schemas.microsoft.com/office/2006/metadata/properties" ma:root="true" ma:fieldsID="d04262c8c13f3e7f52107fbeea22bf7e" ns3:_="" ns4:_="">
     <xsd:import namespace="7c097320-6bba-49ec-a060-a2cd4188ceea"/>
@@ -10703,13 +10699,11 @@
 </ct:contentTypeSchema>
 </file>
 
-<file path=customXml/item3.xml><?xml version="1.0" encoding="utf-8"?>
-<p:properties xmlns:p="http://schemas.microsoft.com/office/2006/metadata/properties" xmlns:xsi="http://www.w3.org/2001/XMLSchema-instance" xmlns:pc="http://schemas.microsoft.com/office/infopath/2007/PartnerControls">
-  <documentManagement/>
-</p:properties>
+<file path=customXml/item2.xml><?xml version="1.0" encoding="utf-8"?>
+<b:Sources xmlns:b="http://schemas.openxmlformats.org/officeDocument/2006/bibliography" xmlns="http://schemas.openxmlformats.org/officeDocument/2006/bibliography" SelectedStyle="" StyleName=""/>
 </file>
 
-<file path=customXml/item4.xml><?xml version="1.0" encoding="utf-8"?>
+<file path=customXml/item3.xml><?xml version="1.0" encoding="utf-8"?>
 <?mso-contentType ?>
 <FormTemplates xmlns="http://schemas.microsoft.com/sharepoint/v3/contenttype/forms">
   <Display>DocumentLibraryForm</Display>
@@ -10718,15 +10712,13 @@
 </FormTemplates>
 </file>
 
-<file path=customXml/itemProps1.xml><?xml version="1.0" encoding="utf-8"?>
-<ds:datastoreItem xmlns:ds="http://schemas.openxmlformats.org/officeDocument/2006/customXml" ds:itemID="{8118E9C1-FB63-4F97-A222-D7ADC7999B27}">
-  <ds:schemaRefs>
-    <ds:schemaRef ds:uri="http://schemas.openxmlformats.org/officeDocument/2006/bibliography"/>
-  </ds:schemaRefs>
-</ds:datastoreItem>
+<file path=customXml/item4.xml><?xml version="1.0" encoding="utf-8"?>
+<p:properties xmlns:p="http://schemas.microsoft.com/office/2006/metadata/properties" xmlns:xsi="http://www.w3.org/2001/XMLSchema-instance" xmlns:pc="http://schemas.microsoft.com/office/infopath/2007/PartnerControls">
+  <documentManagement/>
+</p:properties>
 </file>
 
-<file path=customXml/itemProps2.xml><?xml version="1.0" encoding="utf-8"?>
+<file path=customXml/itemProps1.xml><?xml version="1.0" encoding="utf-8"?>
 <ds:datastoreItem xmlns:ds="http://schemas.openxmlformats.org/officeDocument/2006/customXml" ds:itemID="{C4F4A0A0-25B6-4F0C-9000-00BC1F5E7081}">
   <ds:schemaRefs>
     <ds:schemaRef ds:uri="http://schemas.microsoft.com/office/2006/metadata/contentType"/>
@@ -10745,19 +10737,27 @@
 </ds:datastoreItem>
 </file>
 
+<file path=customXml/itemProps2.xml><?xml version="1.0" encoding="utf-8"?>
+<ds:datastoreItem xmlns:ds="http://schemas.openxmlformats.org/officeDocument/2006/customXml" ds:itemID="{8118E9C1-FB63-4F97-A222-D7ADC7999B27}">
+  <ds:schemaRefs>
+    <ds:schemaRef ds:uri="http://schemas.openxmlformats.org/officeDocument/2006/bibliography"/>
+  </ds:schemaRefs>
+</ds:datastoreItem>
+</file>
+
 <file path=customXml/itemProps3.xml><?xml version="1.0" encoding="utf-8"?>
+<ds:datastoreItem xmlns:ds="http://schemas.openxmlformats.org/officeDocument/2006/customXml" ds:itemID="{1938C5F5-34C8-4331-979B-AD4F4FBB7811}">
+  <ds:schemaRefs>
+    <ds:schemaRef ds:uri="http://schemas.microsoft.com/sharepoint/v3/contenttype/forms"/>
+  </ds:schemaRefs>
+</ds:datastoreItem>
+</file>
+
+<file path=customXml/itemProps4.xml><?xml version="1.0" encoding="utf-8"?>
 <ds:datastoreItem xmlns:ds="http://schemas.openxmlformats.org/officeDocument/2006/customXml" ds:itemID="{2ED5450E-C08E-45C4-87B0-B0BBB0EC6EDB}">
   <ds:schemaRefs>
     <ds:schemaRef ds:uri="http://schemas.microsoft.com/office/2006/metadata/properties"/>
     <ds:schemaRef ds:uri="http://schemas.microsoft.com/office/infopath/2007/PartnerControls"/>
   </ds:schemaRefs>
 </ds:datastoreItem>
-</file>
-
-<file path=customXml/itemProps4.xml><?xml version="1.0" encoding="utf-8"?>
-<ds:datastoreItem xmlns:ds="http://schemas.openxmlformats.org/officeDocument/2006/customXml" ds:itemID="{1938C5F5-34C8-4331-979B-AD4F4FBB7811}">
-  <ds:schemaRefs>
-    <ds:schemaRef ds:uri="http://schemas.microsoft.com/sharepoint/v3/contenttype/forms"/>
-  </ds:schemaRefs>
-</ds:datastoreItem>
 </file>
</xml_diff>

<commit_message>
Zadnje dorade stilova diplomskog rada
</commit_message>
<xml_diff>
--- a/Diplomski_rad_predložak_lipanj_2026.docx
+++ b/Diplomski_rad_predložak_lipanj_2026.docx
@@ -3611,10 +3611,10 @@
             <v:path o:extrusionok="f" gradientshapeok="t" o:connecttype="rect"/>
             <o:lock v:ext="edit" aspectratio="t"/>
           </v:shapetype>
-          <v:shape id="_x0000_i1025" type="#_x0000_t75" style="width:219pt;height:77.4pt" o:ole="">
+          <v:shape id="_x0000_i1025" type="#_x0000_t75" style="width:219pt;height:77.25pt" o:ole="">
             <v:imagedata r:id="rId14" o:title=""/>
           </v:shape>
-          <o:OLEObject Type="Embed" ProgID="Visio.Drawing.6" ShapeID="_x0000_i1025" DrawAspect="Content" ObjectID="_1843916854" r:id="rId15"/>
+          <o:OLEObject Type="Embed" ProgID="Visio.Drawing.6" ShapeID="_x0000_i1025" DrawAspect="Content" ObjectID="_1843974726" r:id="rId15"/>
         </w:object>
       </w:r>
     </w:p>
@@ -5252,7 +5252,7 @@
     </w:p>
     <w:p>
       <w:pPr>
-        <w:pStyle w:val="Kd"/>
+        <w:pStyle w:val="slika"/>
       </w:pPr>
       <w:proofErr w:type="spellStart"/>
       <w:r>
@@ -5263,6 +5263,7 @@
         <w:t xml:space="preserve"> *</w:t>
       </w:r>
       <w:proofErr w:type="spellStart"/>
+      <w:proofErr w:type="gramStart"/>
       <w:r>
         <w:t>trazizad</w:t>
       </w:r>
@@ -5271,6 +5272,7 @@
         <w:t>(</w:t>
       </w:r>
       <w:proofErr w:type="spellStart"/>
+      <w:proofErr w:type="gramEnd"/>
       <w:r>
         <w:t>char</w:t>
       </w:r>
@@ -10477,6 +10479,10 @@
 </file>
 
 <file path=customXml/item1.xml><?xml version="1.0" encoding="utf-8"?>
+<b:Sources xmlns:b="http://schemas.openxmlformats.org/officeDocument/2006/bibliography" xmlns="http://schemas.openxmlformats.org/officeDocument/2006/bibliography" SelectedStyle="" StyleName=""/>
+</file>
+
+<file path=customXml/item2.xml><?xml version="1.0" encoding="utf-8"?>
 <ct:contentTypeSchema xmlns:ct="http://schemas.microsoft.com/office/2006/metadata/contentType" xmlns:ma="http://schemas.microsoft.com/office/2006/metadata/properties/metaAttributes" ct:_="" ma:_="" ma:contentTypeName="Dokument" ma:contentTypeID="0x0101008B745E83D8115245A8D1ADF80A3890BA" ma:contentTypeVersion="13" ma:contentTypeDescription="Stvaranje novog dokumenta." ma:contentTypeScope="" ma:versionID="a27f2829a275489d5984aa1a72490b89">
   <xsd:schema xmlns:xsd="http://www.w3.org/2001/XMLSchema" xmlns:xs="http://www.w3.org/2001/XMLSchema" xmlns:p="http://schemas.microsoft.com/office/2006/metadata/properties" xmlns:ns3="7c097320-6bba-49ec-a060-a2cd4188ceea" xmlns:ns4="c90fddfb-63ac-4e82-9923-c0faed2978db" targetNamespace="http://schemas.microsoft.com/office/2006/metadata/properties" ma:root="true" ma:fieldsID="d04262c8c13f3e7f52107fbeea22bf7e" ns3:_="" ns4:_="">
     <xsd:import namespace="7c097320-6bba-49ec-a060-a2cd4188ceea"/>
@@ -10699,11 +10705,13 @@
 </ct:contentTypeSchema>
 </file>
 
-<file path=customXml/item2.xml><?xml version="1.0" encoding="utf-8"?>
-<b:Sources xmlns:b="http://schemas.openxmlformats.org/officeDocument/2006/bibliography" xmlns="http://schemas.openxmlformats.org/officeDocument/2006/bibliography" SelectedStyle="" StyleName=""/>
+<file path=customXml/item3.xml><?xml version="1.0" encoding="utf-8"?>
+<p:properties xmlns:p="http://schemas.microsoft.com/office/2006/metadata/properties" xmlns:xsi="http://www.w3.org/2001/XMLSchema-instance" xmlns:pc="http://schemas.microsoft.com/office/infopath/2007/PartnerControls">
+  <documentManagement/>
+</p:properties>
 </file>
 
-<file path=customXml/item3.xml><?xml version="1.0" encoding="utf-8"?>
+<file path=customXml/item4.xml><?xml version="1.0" encoding="utf-8"?>
 <?mso-contentType ?>
 <FormTemplates xmlns="http://schemas.microsoft.com/sharepoint/v3/contenttype/forms">
   <Display>DocumentLibraryForm</Display>
@@ -10712,13 +10720,15 @@
 </FormTemplates>
 </file>
 
-<file path=customXml/item4.xml><?xml version="1.0" encoding="utf-8"?>
-<p:properties xmlns:p="http://schemas.microsoft.com/office/2006/metadata/properties" xmlns:xsi="http://www.w3.org/2001/XMLSchema-instance" xmlns:pc="http://schemas.microsoft.com/office/infopath/2007/PartnerControls">
-  <documentManagement/>
-</p:properties>
+<file path=customXml/itemProps1.xml><?xml version="1.0" encoding="utf-8"?>
+<ds:datastoreItem xmlns:ds="http://schemas.openxmlformats.org/officeDocument/2006/customXml" ds:itemID="{8118E9C1-FB63-4F97-A222-D7ADC7999B27}">
+  <ds:schemaRefs>
+    <ds:schemaRef ds:uri="http://schemas.openxmlformats.org/officeDocument/2006/bibliography"/>
+  </ds:schemaRefs>
+</ds:datastoreItem>
 </file>
 
-<file path=customXml/itemProps1.xml><?xml version="1.0" encoding="utf-8"?>
+<file path=customXml/itemProps2.xml><?xml version="1.0" encoding="utf-8"?>
 <ds:datastoreItem xmlns:ds="http://schemas.openxmlformats.org/officeDocument/2006/customXml" ds:itemID="{C4F4A0A0-25B6-4F0C-9000-00BC1F5E7081}">
   <ds:schemaRefs>
     <ds:schemaRef ds:uri="http://schemas.microsoft.com/office/2006/metadata/contentType"/>
@@ -10737,27 +10747,19 @@
 </ds:datastoreItem>
 </file>
 
-<file path=customXml/itemProps2.xml><?xml version="1.0" encoding="utf-8"?>
-<ds:datastoreItem xmlns:ds="http://schemas.openxmlformats.org/officeDocument/2006/customXml" ds:itemID="{8118E9C1-FB63-4F97-A222-D7ADC7999B27}">
-  <ds:schemaRefs>
-    <ds:schemaRef ds:uri="http://schemas.openxmlformats.org/officeDocument/2006/bibliography"/>
-  </ds:schemaRefs>
-</ds:datastoreItem>
-</file>
-
 <file path=customXml/itemProps3.xml><?xml version="1.0" encoding="utf-8"?>
-<ds:datastoreItem xmlns:ds="http://schemas.openxmlformats.org/officeDocument/2006/customXml" ds:itemID="{1938C5F5-34C8-4331-979B-AD4F4FBB7811}">
-  <ds:schemaRefs>
-    <ds:schemaRef ds:uri="http://schemas.microsoft.com/sharepoint/v3/contenttype/forms"/>
-  </ds:schemaRefs>
-</ds:datastoreItem>
-</file>
-
-<file path=customXml/itemProps4.xml><?xml version="1.0" encoding="utf-8"?>
 <ds:datastoreItem xmlns:ds="http://schemas.openxmlformats.org/officeDocument/2006/customXml" ds:itemID="{2ED5450E-C08E-45C4-87B0-B0BBB0EC6EDB}">
   <ds:schemaRefs>
     <ds:schemaRef ds:uri="http://schemas.microsoft.com/office/2006/metadata/properties"/>
     <ds:schemaRef ds:uri="http://schemas.microsoft.com/office/infopath/2007/PartnerControls"/>
   </ds:schemaRefs>
 </ds:datastoreItem>
+</file>
+
+<file path=customXml/itemProps4.xml><?xml version="1.0" encoding="utf-8"?>
+<ds:datastoreItem xmlns:ds="http://schemas.openxmlformats.org/officeDocument/2006/customXml" ds:itemID="{1938C5F5-34C8-4331-979B-AD4F4FBB7811}">
+  <ds:schemaRefs>
+    <ds:schemaRef ds:uri="http://schemas.microsoft.com/sharepoint/v3/contenttype/forms"/>
+  </ds:schemaRefs>
+</ds:datastoreItem>
 </file>
</xml_diff>